<commit_message>
Deploy preview for PR 167 🛫
</commit_message>
<xml_diff>
--- a/pr-preview/pr-167/vignettes/articles/quarto_article.docx
+++ b/pr-preview/pr-167/vignettes/articles/quarto_article.docx
@@ -23,7 +23,7 @@
         <w:pStyle w:val="Date"/>
       </w:pPr>
       <w:r>
-        <w:t xml:space="preserve">2026-07-23</w:t>
+        <w:t xml:space="preserve">2026-07-24</w:t>
       </w:r>
     </w:p>
     <w:p>
@@ -3062,7 +3062,7 @@
       </w:r>
     </w:p>
     <w:bookmarkEnd w:id="35"/>
-    <w:bookmarkStart w:id="48" w:name="theorem-environments"/>
+    <w:bookmarkStart w:id="45" w:name="theorem-environments"/>
     <w:p>
       <w:pPr>
         <w:pStyle w:val="Heading2"/>
@@ -3094,7 +3094,7 @@
         <w:t xml:space="preserve">extension renders Quarto theorem and proof environments as styled callout blocks. This makes theorems, definitions, examples, and proofs visually distinct and easier to navigate.</w:t>
       </w:r>
     </w:p>
-    <w:bookmarkStart w:id="41" w:name="definitions-and-theorems"/>
+    <w:bookmarkStart w:id="38" w:name="definitions-and-theorems"/>
     <w:p>
       <w:pPr>
         <w:pStyle w:val="Heading3"/>
@@ -3108,7 +3108,7 @@
         <w:tblStyle w:val="Table"/>
         <w:tblInd w:w="164" w:type="dxa"/>
         <w:tblBorders>
-          <w:left w:val="single" w:sz="24" w:space="0" w:color="00A047"/>
+          <w:left w:val="single" w:sz="24" w:space="0" w:color="909090"/>
         </w:tblBorders>
         <w:tblCellMar>
           <w:left w:w="0" w:type="dxa"/>
@@ -3136,6 +3136,13 @@
             <w:pPr>
               <w:spacing w:before="16" w:after="64"/>
             </w:pPr>
+            <w:r>
+              <w:rPr>
+                <w:b/>
+                <w:bCs/>
+              </w:rPr>
+              <w:t xml:space="preserve">Definition (Standard Error)</w:t>
+            </w:r>
           </w:p>
           <w:bookmarkStart w:id="36" w:name="def-se"/>
           <w:p>
@@ -3264,7 +3271,7 @@
         <w:tblStyle w:val="Table"/>
         <w:tblInd w:w="164" w:type="dxa"/>
         <w:tblBorders>
-          <w:left w:val="single" w:sz="24" w:space="0" w:color="0758E5"/>
+          <w:left w:val="single" w:sz="24" w:space="0" w:color="909090"/>
         </w:tblBorders>
         <w:tblCellMar>
           <w:left w:w="0" w:type="dxa"/>
@@ -3292,6 +3299,13 @@
             <w:pPr>
               <w:spacing w:before="16" w:after="64"/>
             </w:pPr>
+            <w:r>
+              <w:rPr>
+                <w:b/>
+                <w:bCs/>
+              </w:rPr>
+              <w:t xml:space="preserve">Theorem (Central Limit Theorem)</w:t>
+            </w:r>
           </w:p>
           <w:bookmarkStart w:id="37" w:name="thm-clt"/>
           <w:p>
@@ -3559,10 +3573,10 @@
         <w:tblStyle w:val="Table"/>
         <w:tblLook w:firstRow="0" w:lastRow="0" w:firstColumn="0" w:lastColumn="0" w:noHBand="0" w:noVBand="0" w:val="0000"/>
         <w:tblBorders>
-          <w:top w:val="single" w:sz="4" w:space="0" w:color="0758E5"/>
-          <w:left w:val="single" w:sz="24" w:space="0" w:color="0758E5"/>
-          <w:bottom w:val="single" w:sz="4" w:space="0" w:color="0758E5"/>
-          <w:right w:val="single" w:sz="4" w:space="0" w:color="0758E5"/>
+          <w:top w:val="single" w:sz="4" w:space="0" w:color="909090"/>
+          <w:left w:val="single" w:sz="24" w:space="0" w:color="909090"/>
+          <w:bottom w:val="single" w:sz="4" w:space="0" w:color="909090"/>
+          <w:right w:val="single" w:sz="4" w:space="0" w:color="909090"/>
         </w:tblBorders>
         <w:tblCellMar>
           <w:left w:w="144" w:type="dxa"/>
@@ -3576,7 +3590,7 @@
         </w:trPr>
         <w:tc>
           <w:tcPr>
-            <w:shd w:color="auto" w:fill="dae6fb" w:val="clear"/>
+            <w:shd w:color="auto" w:fill="e6e6e6" w:val="clear"/>
             <w:tcMar>
               <w:top w:w="92" w:type="dxa"/>
               <w:bottom w:w="92" w:type="dxa"/>
@@ -3587,57 +3601,8 @@
               <w:pStyle w:val="BodyText"/>
             </w:pPr>
             <w:pPr>
-              <w:spacing w:before="0" w:after="0"/>
-              <w:textAlignment w:val="center"/>
+              <w:spacing w:before="16" w:after="16"/>
             </w:pPr>
-            <w:r>
-              <w:drawing>
-                <wp:inline>
-                  <wp:extent cx="152400" cy="152400"/>
-                  <wp:effectExtent b="0" l="0" r="0" t="0"/>
-                  <wp:docPr descr="" title="" id="39" name="Picture"/>
-                  <a:graphic>
-                    <a:graphicData uri="http://schemas.openxmlformats.org/drawingml/2006/picture">
-                      <pic:pic>
-                        <pic:nvPicPr>
-                          <pic:cNvPr descr="/opt/quarto/share/formats/docx/note.png" id="40" name="Picture"/>
-                          <pic:cNvPicPr>
-                            <a:picLocks noChangeArrowheads="1" noChangeAspect="1"/>
-                          </pic:cNvPicPr>
-                        </pic:nvPicPr>
-                        <pic:blipFill>
-                          <a:blip r:embed="rId38"/>
-                          <a:stretch>
-                            <a:fillRect/>
-                          </a:stretch>
-                        </pic:blipFill>
-                        <pic:spPr bwMode="auto">
-                          <a:xfrm>
-                            <a:off x="0" y="0"/>
-                            <a:ext cx="152400" cy="152400"/>
-                          </a:xfrm>
-                          <a:prstGeom prst="rect">
-                            <a:avLst/>
-                          </a:prstGeom>
-                          <a:noFill/>
-                          <a:ln w="9525">
-                            <a:noFill/>
-                            <a:headEnd/>
-                            <a:tailEnd/>
-                          </a:ln>
-                        </pic:spPr>
-                      </pic:pic>
-                    </a:graphicData>
-                  </a:graphic>
-                </wp:inline>
-              </w:drawing>
-            </w:r>
-            <w:r>
-              <w:t xml:space="preserve"> </w:t>
-            </w:r>
-            <w:r>
-              <w:t xml:space="preserve"> </w:t>
-            </w:r>
             <w:r>
               <w:t xml:space="preserve">Proof</w:t>
             </w:r>
@@ -3677,8 +3642,8 @@
         </w:tc>
       </w:tr>
     </w:tbl>
-    <w:bookmarkEnd w:id="41"/>
-    <w:bookmarkStart w:id="44" w:name="lemmas-and-corollaries"/>
+    <w:bookmarkEnd w:id="38"/>
+    <w:bookmarkStart w:id="41" w:name="lemmas-and-corollaries"/>
     <w:p>
       <w:pPr>
         <w:pStyle w:val="Heading3"/>
@@ -3692,7 +3657,7 @@
         <w:tblStyle w:val="Table"/>
         <w:tblInd w:w="164" w:type="dxa"/>
         <w:tblBorders>
-          <w:left w:val="single" w:sz="24" w:space="0" w:color="0758E5"/>
+          <w:left w:val="single" w:sz="24" w:space="0" w:color="909090"/>
         </w:tblBorders>
         <w:tblCellMar>
           <w:left w:w="0" w:type="dxa"/>
@@ -3720,8 +3685,15 @@
             <w:pPr>
               <w:spacing w:before="16" w:after="64"/>
             </w:pPr>
+            <w:r>
+              <w:rPr>
+                <w:b/>
+                <w:bCs/>
+              </w:rPr>
+              <w:t xml:space="preserve">Lemma (Variance of a Sum)</w:t>
+            </w:r>
           </w:p>
-          <w:bookmarkStart w:id="42" w:name="lem-var-sum"/>
+          <w:bookmarkStart w:id="39" w:name="lem-var-sum"/>
           <w:p>
             <w:pPr>
               <w:pStyle w:val="BodyText"/>
@@ -3864,7 +3836,7 @@
               </m:oMath>
             </m:oMathPara>
           </w:p>
-          <w:bookmarkEnd w:id="42"/>
+          <w:bookmarkEnd w:id="39"/>
         </w:tc>
       </w:tr>
     </w:tbl>
@@ -3881,7 +3853,7 @@
         <w:tblStyle w:val="Table"/>
         <w:tblInd w:w="164" w:type="dxa"/>
         <w:tblBorders>
-          <w:left w:val="single" w:sz="24" w:space="0" w:color="0758E5"/>
+          <w:left w:val="single" w:sz="24" w:space="0" w:color="909090"/>
         </w:tblBorders>
         <w:tblCellMar>
           <w:left w:w="0" w:type="dxa"/>
@@ -3909,8 +3881,15 @@
             <w:pPr>
               <w:spacing w:before="16" w:after="64"/>
             </w:pPr>
+            <w:r>
+              <w:rPr>
+                <w:b/>
+                <w:bCs/>
+              </w:rPr>
+              <w:t xml:space="preserve">Corollary (Confidence Interval from CLT)</w:t>
+            </w:r>
           </w:p>
-          <w:bookmarkStart w:id="43" w:name="cor-se-clt"/>
+          <w:bookmarkStart w:id="40" w:name="cor-se-clt"/>
           <w:p>
             <w:pPr>
               <w:pStyle w:val="BodyText"/>
@@ -4017,12 +3996,12 @@
               </m:oMath>
             </m:oMathPara>
           </w:p>
-          <w:bookmarkEnd w:id="43"/>
+          <w:bookmarkEnd w:id="40"/>
         </w:tc>
       </w:tr>
     </w:tbl>
-    <w:bookmarkEnd w:id="44"/>
-    <w:bookmarkStart w:id="47" w:name="examples-and-exercises"/>
+    <w:bookmarkEnd w:id="41"/>
+    <w:bookmarkStart w:id="44" w:name="examples-and-exercises"/>
     <w:p>
       <w:pPr>
         <w:pStyle w:val="Heading3"/>
@@ -4034,19 +4013,44 @@
     <w:tbl>
       <w:tblPr>
         <w:tblStyle w:val="Table"/>
-        <w:tblInd w:w="164" w:type="dxa"/>
+        <w:tblLook w:firstRow="0" w:lastRow="0" w:firstColumn="0" w:lastColumn="0" w:noHBand="0" w:noVBand="0" w:val="0000"/>
         <w:tblBorders>
-          <w:left w:val="single" w:sz="24" w:space="0" w:color="00A047"/>
+          <w:top w:val="single" w:sz="4" w:space="0" w:color="909090"/>
+          <w:left w:val="single" w:sz="24" w:space="0" w:color="909090"/>
+          <w:bottom w:val="single" w:sz="4" w:space="0" w:color="909090"/>
+          <w:right w:val="single" w:sz="4" w:space="0" w:color="909090"/>
         </w:tblBorders>
         <w:tblCellMar>
-          <w:left w:w="0" w:type="dxa"/>
-          <w:right w:w="0" w:type="dxa"/>
+          <w:left w:w="144" w:type="dxa"/>
+          <w:right w:w="144" w:type="dxa"/>
         </w:tblCellMar>
         <w:tblLook w:firstRow="0" w:lastRow="0" w:firstColumn="0" w:lastColumn="0" w:noHBand="0" w:noVBand="0" w:val="0000"/>
       </w:tblPr>
-      <w:tblGrid>
-        <w:gridCol w:w="7920"/>
-      </w:tblGrid>
+      <w:tr>
+        <w:trPr>
+          <w:cantSplit/>
+        </w:trPr>
+        <w:tc>
+          <w:tcPr>
+            <w:shd w:color="auto" w:fill="e6e6e6" w:val="clear"/>
+            <w:tcMar>
+              <w:top w:w="92" w:type="dxa"/>
+              <w:bottom w:w="92" w:type="dxa"/>
+            </w:tcMar>
+          </w:tcPr>
+          <w:p>
+            <w:pPr>
+              <w:pStyle w:val="FirstParagraph"/>
+            </w:pPr>
+            <w:pPr>
+              <w:spacing w:before="16" w:after="16"/>
+            </w:pPr>
+            <w:r>
+              <w:t xml:space="preserve">Example (95% Confidence Interval)</w:t>
+            </w:r>
+          </w:p>
+        </w:tc>
+      </w:tr>
       <w:tr>
         <w:trPr>
           <w:cantSplit/>
@@ -4054,18 +4058,11 @@
         <w:tc>
           <w:tcPr>
             <w:tcMar>
-              <w:left w:w="144" w:type="dxa"/>
+              <w:top w:w="108" w:type="dxa"/>
+              <w:bottom w:w="108" w:type="dxa"/>
             </w:tcMar>
           </w:tcPr>
-          <w:p>
-            <w:pPr>
-              <w:pStyle w:val="FirstParagraph"/>
-            </w:pPr>
-            <w:pPr>
-              <w:spacing w:before="16" w:after="64"/>
-            </w:pPr>
-          </w:p>
-          <w:bookmarkStart w:id="45" w:name="exm-ci"/>
+          <w:bookmarkStart w:id="42" w:name="exm-ci"/>
           <w:p>
             <w:pPr>
               <w:pStyle w:val="BodyText"/>
@@ -4515,7 +4512,8 @@
               <w:t xml:space="preserve">#&gt; Mean = 4.929, 95% CI: [4.290, 5.567]</w:t>
             </w:r>
           </w:p>
-          <w:bookmarkEnd w:id="45"/>
+          <w:bookmarkEnd w:id="42"/>
+          <w:p/>
         </w:tc>
       </w:tr>
     </w:tbl>
@@ -4532,7 +4530,7 @@
         <w:tblStyle w:val="Table"/>
         <w:tblInd w:w="164" w:type="dxa"/>
         <w:tblBorders>
-          <w:left w:val="single" w:sz="24" w:space="0" w:color="00A047"/>
+          <w:left w:val="single" w:sz="24" w:space="0" w:color="909090"/>
         </w:tblBorders>
         <w:tblCellMar>
           <w:left w:w="0" w:type="dxa"/>
@@ -4560,8 +4558,15 @@
             <w:pPr>
               <w:spacing w:before="16" w:after="64"/>
             </w:pPr>
+            <w:r>
+              <w:rPr>
+                <w:b/>
+                <w:bCs/>
+              </w:rPr>
+              <w:t xml:space="preserve">Exercise (Exercise: Computing Standard Error)</w:t>
+            </w:r>
           </w:p>
-          <w:bookmarkStart w:id="46" w:name="exr-se"/>
+          <w:bookmarkStart w:id="43" w:name="exr-se"/>
           <w:p>
             <w:pPr>
               <w:pStyle w:val="BodyText"/>
@@ -4623,7 +4628,7 @@
               <w:t xml:space="preserve">.</w:t>
             </w:r>
           </w:p>
-          <w:bookmarkEnd w:id="46"/>
+          <w:bookmarkEnd w:id="43"/>
         </w:tc>
       </w:tr>
     </w:tbl>
@@ -4640,10 +4645,10 @@
         <w:tblStyle w:val="Table"/>
         <w:tblLook w:firstRow="0" w:lastRow="0" w:firstColumn="0" w:lastColumn="0" w:noHBand="0" w:noVBand="0" w:val="0000"/>
         <w:tblBorders>
-          <w:top w:val="single" w:sz="4" w:space="0" w:color="0758E5"/>
-          <w:left w:val="single" w:sz="24" w:space="0" w:color="0758E5"/>
-          <w:bottom w:val="single" w:sz="4" w:space="0" w:color="0758E5"/>
-          <w:right w:val="single" w:sz="4" w:space="0" w:color="0758E5"/>
+          <w:top w:val="single" w:sz="4" w:space="0" w:color="909090"/>
+          <w:left w:val="single" w:sz="24" w:space="0" w:color="909090"/>
+          <w:bottom w:val="single" w:sz="4" w:space="0" w:color="909090"/>
+          <w:right w:val="single" w:sz="4" w:space="0" w:color="909090"/>
         </w:tblBorders>
         <w:tblCellMar>
           <w:left w:w="144" w:type="dxa"/>
@@ -4657,7 +4662,7 @@
         </w:trPr>
         <w:tc>
           <w:tcPr>
-            <w:shd w:color="auto" w:fill="dae6fb" w:val="clear"/>
+            <w:shd w:color="auto" w:fill="e6e6e6" w:val="clear"/>
             <w:tcMar>
               <w:top w:w="92" w:type="dxa"/>
               <w:bottom w:w="92" w:type="dxa"/>
@@ -4783,9 +4788,9 @@
         </w:tc>
       </w:tr>
     </w:tbl>
-    <w:bookmarkEnd w:id="47"/>
-    <w:bookmarkEnd w:id="48"/>
-    <w:bookmarkStart w:id="49" w:name="mathematical-notation"/>
+    <w:bookmarkEnd w:id="44"/>
+    <w:bookmarkEnd w:id="45"/>
+    <w:bookmarkStart w:id="46" w:name="mathematical-notation"/>
     <w:p>
       <w:pPr>
         <w:pStyle w:val="Heading2"/>
@@ -4992,8 +4997,8 @@
         </m:oMath>
       </m:oMathPara>
     </w:p>
-    <w:bookmarkEnd w:id="49"/>
-    <w:bookmarkStart w:id="53" w:name="tips-and-best-practices"/>
+    <w:bookmarkEnd w:id="46"/>
+    <w:bookmarkStart w:id="50" w:name="tips-and-best-practices"/>
     <w:p>
       <w:pPr>
         <w:pStyle w:val="Heading2"/>
@@ -5043,18 +5048,18 @@
                 <wp:inline>
                   <wp:extent cx="152400" cy="152400"/>
                   <wp:effectExtent b="0" l="0" r="0" t="0"/>
-                  <wp:docPr descr="" title="" id="51" name="Picture"/>
+                  <wp:docPr descr="" title="" id="48" name="Picture"/>
                   <a:graphic>
                     <a:graphicData uri="http://schemas.openxmlformats.org/drawingml/2006/picture">
                       <pic:pic>
                         <pic:nvPicPr>
-                          <pic:cNvPr descr="/opt/quarto/share/formats/docx/tip.png" id="52" name="Picture"/>
+                          <pic:cNvPr descr="/opt/quarto/share/formats/docx/tip.png" id="49" name="Picture"/>
                           <pic:cNvPicPr>
                             <a:picLocks noChangeArrowheads="1" noChangeAspect="1"/>
                           </pic:cNvPicPr>
                         </pic:nvPicPr>
                         <pic:blipFill>
-                          <a:blip r:embed="rId50"/>
+                          <a:blip r:embed="rId47"/>
                           <a:stretch>
                             <a:fillRect/>
                           </a:stretch>
@@ -5178,8 +5183,8 @@
         </w:tc>
       </w:tr>
     </w:tbl>
-    <w:bookmarkEnd w:id="53"/>
-    <w:bookmarkStart w:id="54" w:name="conclusion"/>
+    <w:bookmarkEnd w:id="50"/>
+    <w:bookmarkStart w:id="51" w:name="conclusion"/>
     <w:p>
       <w:pPr>
         <w:pStyle w:val="Heading2"/>
@@ -5196,8 +5201,8 @@
         <w:t xml:space="preserve">This article demonstrates the advanced capabilities of Quarto for creating rich, interactive documentation for R packages.</w:t>
       </w:r>
     </w:p>
-    <w:bookmarkEnd w:id="54"/>
-    <w:bookmarkStart w:id="58" w:name="learn-more"/>
+    <w:bookmarkEnd w:id="51"/>
+    <w:bookmarkStart w:id="55" w:name="learn-more"/>
     <w:p>
       <w:pPr>
         <w:pStyle w:val="Heading2"/>
@@ -5220,7 +5225,7 @@
       <w:r>
         <w:t xml:space="preserve"> </w:t>
       </w:r>
-      <w:hyperlink r:id="rId55">
+      <w:hyperlink r:id="rId52">
         <w:r>
           <w:rPr>
             <w:rStyle w:val="Hyperlink"/>
@@ -5243,7 +5248,7 @@
       <w:r>
         <w:t xml:space="preserve"> </w:t>
       </w:r>
-      <w:hyperlink r:id="rId56">
+      <w:hyperlink r:id="rId53">
         <w:r>
           <w:rPr>
             <w:rStyle w:val="Hyperlink"/>
@@ -5266,7 +5271,7 @@
       <w:r>
         <w:t xml:space="preserve"> </w:t>
       </w:r>
-      <w:hyperlink r:id="rId57">
+      <w:hyperlink r:id="rId54">
         <w:r>
           <w:rPr>
             <w:rStyle w:val="Hyperlink"/>
@@ -5275,8 +5280,8 @@
         </w:r>
       </w:hyperlink>
     </w:p>
-    <w:bookmarkEnd w:id="58"/>
-    <w:bookmarkStart w:id="60" w:name="references"/>
+    <w:bookmarkEnd w:id="55"/>
+    <w:bookmarkStart w:id="57" w:name="references"/>
     <w:p>
       <w:pPr>
         <w:pStyle w:val="Heading2"/>
@@ -5285,9 +5290,9 @@
         <w:t xml:space="preserve">10 References</w:t>
       </w:r>
     </w:p>
-    <w:bookmarkStart w:id="59" w:name="refs"/>
-    <w:bookmarkEnd w:id="59"/>
-    <w:bookmarkEnd w:id="60"/>
+    <w:bookmarkStart w:id="56" w:name="refs"/>
+    <w:bookmarkEnd w:id="56"/>
+    <w:bookmarkEnd w:id="57"/>
     <w:sectPr>
       <w:footnotePr>
         <w:numRestart w:val="eachSect"/>

</xml_diff>